<commit_message>
chore(fb-595.54.44): refresh Iowa Supreme Court generated engines
</commit_message>
<xml_diff>
--- a/courts/eighth-circuit/iowa/state/supreme-court/amicus-brief/usage/OUTPUT-amicus-brief.docx
+++ b/courts/eighth-circuit/iowa/state/supreme-court/amicus-brief/usage/OUTPUT-amicus-brief.docx
@@ -9034,13 +9034,13 @@
         <w:t xml:space="preserve"> </w:t>
       </w:r>
       <w:r>
-        <w:t xml:space="preserve">(2026), https://ihaonline.org/​wp-content/​uploads/2026/03/26Mission-Essential</w:t>
+        <w:t xml:space="preserve">(2026), https://​​ihaonline.​org/​​wp-​content/​​uploads/​​2026/​​03/​​26Mission-​Essential</w:t>
       </w:r>
       <w:r>
         <w:noBreakHyphen/>
       </w:r>
       <w:r>
-        <w:t xml:space="preserve">2.pdf. Among the challenges include thousands of open positions in Iowa’s hospitals. See</w:t>
+        <w:t xml:space="preserve">2.​pdf. Among the challenges include thousands of open positions in Iowa’s hospitals. See</w:t>
       </w:r>
       <w:r>
         <w:t xml:space="preserve"> </w:t>
@@ -9137,13 +9137,13 @@
         <w:t xml:space="preserve"> </w:t>
       </w:r>
       <w:r>
-        <w:t xml:space="preserve">4 (2026), https://ihaonline.org/​wp-content/​uploads/2026/03/26Mission-Essential</w:t>
+        <w:t xml:space="preserve">4 (2026), https://​​ihaonline.​org/​​wp-​content/​​uploads/​​2026/​​03/​​26Mission-​Essential</w:t>
       </w:r>
       <w:r>
         <w:noBreakHyphen/>
       </w:r>
       <w:r>
-        <w:t xml:space="preserve">2.pdf.</w:t>
+        <w:t xml:space="preserve">2.​pdf.</w:t>
       </w:r>
     </w:p>
   </w:footnote>
@@ -9885,6 +9885,7 @@
     <w:unhideWhenUsed/>
     <w:qFormat/>
     <w:pPr>
+      <w:keepLines/>
       <w:spacing w:before="0" w:after="140" w:line="322" w:lineRule="exact"/>
     </w:pPr>
     <w:rPr>

</xml_diff>

<commit_message>
court(iowa): amicus brief gated on the shared model, URL, sign and hard-break rules landed (fb-595.54.44)
Co-Authored-By: Claude Opus 5.5 <noreply@anthropic.com>
</commit_message>
<xml_diff>
--- a/courts/eighth-circuit/iowa/state/supreme-court/amicus-brief/usage/OUTPUT-amicus-brief.docx
+++ b/courts/eighth-circuit/iowa/state/supreme-court/amicus-brief/usage/OUTPUT-amicus-brief.docx
@@ -4504,9 +4504,9 @@
         <w:t xml:space="preserve"> </w:t>
       </w:r>
       <w:r>
-        <w:t xml:space="preserve">https://ihaonline.org/​wp-content/​uploads/2026/03/26Mission-Essential</w:t>
+        <w:t xml:space="preserve">https://​ihaonline.​org/​wp-​content/​uploads/​2026/​03/​26Mission-​Essential</w:t>
         <w:noBreakHyphen/>
-        <w:t xml:space="preserve">2.pdf</w:t>
+        <w:t xml:space="preserve">2.​pdf</w:t>
       </w:r>
       <w:r>
         <w:t xml:space="preserve">   </w:t>
@@ -4597,7 +4597,7 @@
         <w:tab/>
       </w:r>
       <w:r>
-        <w:t xml:space="preserve">19, 20</w:t>
+        <w:t xml:space="preserve">20</w:t>
       </w:r>
     </w:p>
     <w:p>
@@ -5161,7 +5161,7 @@
         <w:t xml:space="preserve"> </w:t>
       </w:r>
       <w:r>
-        <w:t xml:space="preserve">the court . . . shall instruct the jury to answer special interrogatories or, if there is no jury, shall make findings, indicating all of the following: . . . The percentage of the total fault allocated to each claimant, defendant, third-party defendant, person who has been released from liability under section 668.7,</w:t>
+        <w:t xml:space="preserve">the court . . . shall instruct the jury to answer special interrogatories or, if there is no jury, shall make findings, indicating all of the following: . . . The percentage of the total fault allocated to each claimant, defendant, third-party defendant, person who has been released from liability under section 668.7,</w:t>
       </w:r>
       <w:r>
         <w:t xml:space="preserve"> </w:t>
@@ -5314,7 +5314,7 @@
         <w:t xml:space="preserve"> </w:t>
       </w:r>
       <w:r>
-        <w:t xml:space="preserve">“the claim of the releasing person against other persons is reduced by the amount of the released person’s equitable share of the obligation . . . .”</w:t>
+        <w:t xml:space="preserve">“the claim of the releasing person against other persons is reduced by the amount of the released person’s equitable share of the obligation . . . .”</w:t>
       </w:r>
       <w:r>
         <w:t xml:space="preserve">). Given the breadth of the Act, this Court has declined to read in exceptions. See</w:t>
@@ -9034,7 +9034,7 @@
         <w:t xml:space="preserve"> </w:t>
       </w:r>
       <w:r>
-        <w:t xml:space="preserve">(2026), https://​​ihaonline.​org/​​wp-​content/​​uploads/​​2026/​​03/​​26Mission-​Essential</w:t>
+        <w:t xml:space="preserve">(2026), https://​ihaonline.​org/​wp-​content/​uploads/​2026/​03/​26Mission-​Essential</w:t>
       </w:r>
       <w:r>
         <w:noBreakHyphen/>
@@ -9137,7 +9137,7 @@
         <w:t xml:space="preserve"> </w:t>
       </w:r>
       <w:r>
-        <w:t xml:space="preserve">4 (2026), https://​​ihaonline.​org/​​wp-​content/​​uploads/​​2026/​​03/​​26Mission-​Essential</w:t>
+        <w:t xml:space="preserve">4 (2026), https://​ihaonline.​org/​wp-​content/​uploads/​2026/​03/​26Mission-​Essential</w:t>
       </w:r>
       <w:r>
         <w:noBreakHyphen/>
@@ -10138,6 +10138,33 @@
       <w:ind w:left="2160" w:hanging="720"/>
     </w:pPr>
   </w:style>
+  <w:style w:type="paragraph" w:customStyle="1" w:styleId="XdQuoteList1">
+    <w:name w:val="Xd Quote List 1"/>
+    <w:basedOn w:val="Normal"/>
+    <w:qFormat/>
+    <w:pPr>
+      <w:spacing w:before="0" w:after="0" w:line="322" w:lineRule="exact"/>
+      <w:ind w:left="1440" w:right="720" w:hanging="720"/>
+    </w:pPr>
+  </w:style>
+  <w:style w:type="paragraph" w:customStyle="1" w:styleId="XdQuoteList2">
+    <w:name w:val="Xd Quote List 2"/>
+    <w:basedOn w:val="Normal"/>
+    <w:qFormat/>
+    <w:pPr>
+      <w:spacing w:before="0" w:after="0" w:line="322" w:lineRule="exact"/>
+      <w:ind w:left="2160" w:right="720" w:hanging="720"/>
+    </w:pPr>
+  </w:style>
+  <w:style w:type="paragraph" w:customStyle="1" w:styleId="XdQuoteList3">
+    <w:name w:val="Xd Quote List 3"/>
+    <w:basedOn w:val="Normal"/>
+    <w:qFormat/>
+    <w:pPr>
+      <w:spacing w:before="0" w:after="0" w:line="322" w:lineRule="exact"/>
+      <w:ind w:left="2880" w:right="720" w:hanging="720"/>
+    </w:pPr>
+  </w:style>
   <w:style w:type="paragraph" w:customStyle="1" w:styleId="XdQuoteOnly">
     <w:name w:val="XdQuoteOnly"/>
     <w:basedOn w:val="BodyText"/>

</xml_diff>